<commit_message>
fix: align resume facts and recruiter-facing AI presentation
</commit_message>
<xml_diff>
--- a/apps/web/public/assets/张锦鹏-秋招简历.docx
+++ b/apps/web/public/assets/张锦鹏-秋招简历.docx
@@ -930,33 +930,31 @@
         <w:rPr>
           <w:lang w:eastAsia="zh-CN"/>
         </w:rPr>
-        <w:t>GPA：3.</w:t>
+        <w:t>GPA：3.85</w:t>
       </w:r>
       <w:r>
         <w:rPr>
           <w:rFonts w:hint="eastAsia"/>
           <w:lang w:eastAsia="zh-CN"/>
         </w:rPr>
-        <w:t>67</w:t>
       </w:r>
       <w:r>
         <w:rPr>
           <w:lang w:eastAsia="zh-CN"/>
         </w:rPr>
-        <w:t xml:space="preserve">/4.0，专业排名前 </w:t>
+        <w:t>/4.0，专业排名前 2%</w:t>
       </w:r>
       <w:r>
         <w:rPr>
           <w:rFonts w:hint="eastAsia"/>
           <w:lang w:eastAsia="zh-CN"/>
         </w:rPr>
-        <w:t>5</w:t>
       </w:r>
       <w:r>
         <w:rPr>
           <w:lang w:eastAsia="zh-CN"/>
         </w:rPr>
-        <w:t>%；担任院学信委人工智能学院副主席、班级学习委员、甲骨文社团社长。</w:t>
+        <w:t>；担任院学信委人工智能学院副主席、班级学习委员、甲骨文社团社长。</w:t>
       </w:r>
     </w:p>
     <w:p>
@@ -988,7 +986,7 @@
         <w:rPr>
           <w:lang w:eastAsia="zh-CN"/>
         </w:rPr>
-        <w:t>累计获国家级奖项 5 项、省市级奖项 6 项，覆盖大数据开发、数据分析、网络安全等领域。</w:t>
+        <w:t>累计获国家级奖项 3 项、省市级奖项 8 项，覆盖大数据开发、数据分析、网络安全等领域。</w:t>
       </w:r>
     </w:p>
     <w:p>

</xml_diff>